<commit_message>
Add real DOCX protocol extraction
</commit_message>
<xml_diff>
--- a/scripts/fixtures/minimal.docx
+++ b/scripts/fixtures/minimal.docx
@@ -1,12 +1,33 @@
 
-<file path=word\document.xml><?xml version="1.0" encoding="utf-8"?>
+<file path=word/document.xml><?xml version="1.0" encoding="utf-8"?>
 <w:document xmlns:w="http://schemas.openxmlformats.org/wordprocessingml/2006/main">
   <w:body>
+    <w:p>
+      <w:pPr>
+        <w:pStyle w:val="Heading1"/>
+      </w:pPr>
+      <w:r>
+        <w:t>1 Introduction</w:t>
+      </w:r>
+    </w:p>
     <w:p>
       <w:r>
         <w:t>Minimal test protocol for import smoke.</w:t>
       </w:r>
     </w:p>
+    <w:p>
+      <w:pPr>
+        <w:pStyle w:val="Heading2"/>
+      </w:pPr>
+      <w:r>
+        <w:t>1.1 Background</w:t>
+      </w:r>
+    </w:p>
+    <w:p>
+      <w:r>
+        <w:t>Background narrative for extraction testing.</w:t>
+      </w:r>
+    </w:p>
   </w:body>
 </w:document>
 </file>
</xml_diff>